<commit_message>
Update CV: add photo, new email, Deutsche Bank and Dutch consulate in reception role
Co-Authored-By: Claude Sonnet 5.5 <noreply@anthropic.com>
Claude-Session: https://claude.ai/code/session_016uyAUFDHPJvxzGjVBpxCpm
</commit_message>
<xml_diff>
--- a/CV_Milagros_Borda_gestione.docx
+++ b/CV_Milagros_Borda_gestione.docx
@@ -2,53 +2,126 @@
 <file path=word/document.xml><?xml version="1.0" encoding="utf-8"?>
 <w:document xmlns:wpc="http://schemas.microsoft.com/office/word/2010/wordprocessingCanvas" xmlns:mo="http://schemas.microsoft.com/office/mac/office/2008/main" xmlns:mc="http://schemas.openxmlformats.org/markup-compatibility/2006" xmlns:mv="urn:schemas-microsoft-com:mac:vml" xmlns:o="urn:schemas-microsoft-com:office:office" xmlns:r="http://schemas.openxmlformats.org/officeDocument/2006/relationships" xmlns:m="http://schemas.openxmlformats.org/officeDocument/2006/math" xmlns:v="urn:schemas-microsoft-com:vml" xmlns:wp14="http://schemas.microsoft.com/office/word/2010/wordprocessingDrawing" xmlns:wp="http://schemas.openxmlformats.org/drawingml/2006/wordprocessingDrawing" xmlns:w10="urn:schemas-microsoft-com:office:word" xmlns:w="http://schemas.openxmlformats.org/wordprocessingml/2006/main" xmlns:w14="http://schemas.microsoft.com/office/word/2010/wordml" xmlns:wpg="http://schemas.microsoft.com/office/word/2010/wordprocessingGroup" xmlns:wpi="http://schemas.microsoft.com/office/word/2010/wordprocessingInk" xmlns:wne="http://schemas.microsoft.com/office/word/2006/wordml" xmlns:wps="http://schemas.microsoft.com/office/word/2010/wordprocessingShape" mc:Ignorable="w14 wp14">
   <w:body>
-    <w:p>
-      <w:r>
-        <w:rPr>
-          <w:b/>
-          <w:i w:val="0"/>
-          <w:color w:val="2B2F36"/>
-          <w:sz w:val="48"/>
-        </w:rPr>
-        <w:t>Milagros Borda</w:t>
-      </w:r>
-    </w:p>
-    <w:p>
-      <w:pPr>
-        <w:spacing w:after="60"/>
-      </w:pPr>
-      <w:r>
-        <w:rPr>
-          <w:b w:val="0"/>
-          <w:i w:val="0"/>
-          <w:color w:val="1F4E6B"/>
-          <w:sz w:val="24"/>
-        </w:rPr>
-        <w:t>Amministrazione e gestione d'impresa  ·  Back office commerciale</w:t>
-      </w:r>
-    </w:p>
-    <w:p>
-      <w:r>
-        <w:rPr>
-          <w:b w:val="0"/>
-          <w:i w:val="0"/>
-          <w:color w:val="595F68"/>
-          <w:sz w:val="20"/>
-        </w:rPr>
-        <w:t>Milano (zona Bande Nere)   ·   +39 392 126 1202   ·   milita00021@gmail.com</w:t>
-      </w:r>
-    </w:p>
-    <w:p>
-      <w:r>
-        <w:rPr>
-          <w:b w:val="0"/>
-          <w:i w:val="0"/>
-          <w:color w:val="595F68"/>
-          <w:sz w:val="20"/>
-        </w:rPr>
-        <w:t>Autorizzata a lavorare in Italia (permesso di soggiorno in corso di validità)</w:t>
-      </w:r>
-    </w:p>
+    <w:tbl>
+      <w:tblPr>
+        <w:tblW w:type="auto" w:w="0"/>
+        <w:tblLayout w:type="fixed"/>
+        <w:tblLook w:firstColumn="1" w:firstRow="1" w:lastColumn="0" w:lastRow="0" w:noHBand="0" w:noVBand="1" w:val="04A0"/>
+      </w:tblPr>
+      <w:tblGrid>
+        <w:gridCol w:w="8050"/>
+        <w:gridCol w:w="1814"/>
+      </w:tblGrid>
+      <w:tr>
+        <w:tc>
+          <w:tcPr>
+            <w:tcW w:type="dxa" w:w="8050"/>
+          </w:tcPr>
+          <w:p>
+            <w:r>
+              <w:rPr>
+                <w:b/>
+                <w:i w:val="0"/>
+                <w:color w:val="2B2F36"/>
+                <w:sz w:val="48"/>
+              </w:rPr>
+              <w:t>Milagros Borda</w:t>
+            </w:r>
+          </w:p>
+          <w:p>
+            <w:pPr>
+              <w:spacing w:after="60"/>
+            </w:pPr>
+            <w:r>
+              <w:rPr>
+                <w:b w:val="0"/>
+                <w:i w:val="0"/>
+                <w:color w:val="1F4E6B"/>
+                <w:sz w:val="24"/>
+              </w:rPr>
+              <w:t>Amministrazione e gestione d'impresa  ·  Back office commerciale</w:t>
+            </w:r>
+          </w:p>
+          <w:p>
+            <w:r>
+              <w:rPr>
+                <w:b w:val="0"/>
+                <w:i w:val="0"/>
+                <w:color w:val="595F68"/>
+                <w:sz w:val="20"/>
+              </w:rPr>
+              <w:t>Milano (zona Bande Nere)   ·   +39 392 126 1202</w:t>
+            </w:r>
+          </w:p>
+          <w:p>
+            <w:r>
+              <w:rPr>
+                <w:b w:val="0"/>
+                <w:i w:val="0"/>
+                <w:color w:val="595F68"/>
+                <w:sz w:val="20"/>
+              </w:rPr>
+              <w:t>jhakelin.borda@gmail.com</w:t>
+            </w:r>
+          </w:p>
+          <w:p>
+            <w:r>
+              <w:rPr>
+                <w:b w:val="0"/>
+                <w:i w:val="0"/>
+                <w:color w:val="595F68"/>
+                <w:sz w:val="20"/>
+              </w:rPr>
+              <w:t>Autorizzata a lavorare in Italia (permesso di soggiorno in corso di validità)</w:t>
+            </w:r>
+          </w:p>
+        </w:tc>
+        <w:tc>
+          <w:tcPr>
+            <w:tcW w:type="dxa" w:w="1814"/>
+          </w:tcPr>
+          <w:p>
+            <w:pPr>
+              <w:jc w:val="right"/>
+            </w:pPr>
+            <w:r>
+              <w:drawing>
+                <wp:inline xmlns:a="http://schemas.openxmlformats.org/drawingml/2006/main" xmlns:pic="http://schemas.openxmlformats.org/drawingml/2006/picture">
+                  <wp:extent cx="1080000" cy="1080000"/>
+                  <wp:docPr id="1" name="Picture 1"/>
+                  <wp:cNvGraphicFramePr>
+                    <a:graphicFrameLocks noChangeAspect="1"/>
+                  </wp:cNvGraphicFramePr>
+                  <a:graphic>
+                    <a:graphicData uri="http://schemas.openxmlformats.org/drawingml/2006/picture">
+                      <pic:pic>
+                        <pic:nvPicPr>
+                          <pic:cNvPr id="0" name="photo.png"/>
+                          <pic:cNvPicPr/>
+                        </pic:nvPicPr>
+                        <pic:blipFill>
+                          <a:blip r:embed="rId9"/>
+                          <a:stretch>
+                            <a:fillRect/>
+                          </a:stretch>
+                        </pic:blipFill>
+                        <pic:spPr>
+                          <a:xfrm>
+                            <a:off x="0" y="0"/>
+                            <a:ext cx="1080000" cy="1080000"/>
+                          </a:xfrm>
+                          <a:prstGeom prst="rect"/>
+                        </pic:spPr>
+                      </pic:pic>
+                    </a:graphicData>
+                  </a:graphic>
+                </wp:inline>
+              </w:drawing>
+            </w:r>
+          </w:p>
+        </w:tc>
+      </w:tr>
+    </w:tbl>
     <w:p>
       <w:pPr>
         <w:keepNext/>
@@ -259,7 +332,7 @@
           <w:i/>
           <w:color w:val="595F68"/>
         </w:rPr>
-        <w:t>Cooperativa, edificio multi-impresa (studi professionali e istituti bancari), Milano</w:t>
+        <w:t>Cooperativa, edificio direzionale multi-impresa (tra cui Deutsche Bank e Consolato dei Paesi Bassi), Milano</w:t>
       </w:r>
     </w:p>
     <w:p>
@@ -273,7 +346,7 @@
           <w:b w:val="0"/>
           <w:i w:val="0"/>
         </w:rPr>
-        <w:t>Accoglienza e assistenza a clienti e visitatori di imprese diverse, in un contesto di alta attenzione alla riservatezza e alla sicurezza.</w:t>
+        <w:t>Accoglienza e assistenza a clienti e visitatori delle imprese e degli enti presenti nell'edificio, tra cui Deutsche Bank e il Consolato dei Paesi Bassi, in un contesto internazionale di alta attenzione alla riservatezza e alla sicurezza.</w:t>
       </w:r>
     </w:p>
     <w:p>

</xml_diff>